<commit_message>
Model cards: clean in-document Contents + rendered PDF preview
pandoc's --toc emits a TOC field that only populates in Word (renders empty in a
headless LibreOffice/PDF render). Replaced it with a plain in-document "Contents"
list (real content -> renders in every viewer) and regenerated the docx without
--toc. Added MODEL_CARDS.pdf as a rendered preview (LibreOffice; 17 pages, both
graphs embedded, all 19 tables intact). Verified page-by-page.

Co-Authored-By: Claude Opus 4.8 <noreply@anthropic.com>
</commit_message>
<xml_diff>
--- a/alphafold_benchmark/MODEL_CARDS.docx
+++ b/alphafold_benchmark/MODEL_CARDS.docx
@@ -10,32 +10,6 @@
         <w:t xml:space="preserve">DOMAS Calibrated Scores — Model Cards</w:t>
       </w:r>
     </w:p>
-    <w:sdt>
-      <w:sdtPr>
-        <w:docPartObj>
-          <w:docPartGallery w:val="Table of Contents"/>
-          <w:docPartUnique/>
-        </w:docPartObj>
-      </w:sdtPr>
-      <w:sdtContent>
-        <w:p>
-          <w:pPr>
-            <w:pStyle w:val="TOCHeading"/>
-          </w:pPr>
-          <w:r>
-            <w:t xml:space="preserve">Table of Contents</w:t>
-          </w:r>
-        </w:p>
-        <w:p>
-          <w:r>
-            <w:fldChar w:fldCharType="begin" w:dirty="true"/>
-            <w:instrText xml:space="preserve">TOC \o "1-2" \h \z \u</w:instrText>
-            <w:fldChar w:fldCharType="separate"/>
-            <w:fldChar w:fldCharType="end"/>
-          </w:r>
-        </w:p>
-      </w:sdtContent>
-    </w:sdt>
     <w:bookmarkStart w:id="35" w:name="domas-calibrated-scores--model-cards"/>
     <w:p>
       <w:pPr>
@@ -372,6 +346,142 @@
       </w:r>
     </w:p>
     <w:p>
+      <w:pPr>
+        <w:pStyle w:val="BodyText"/>
+      </w:pPr>
+      <w:r>
+        <w:rPr>
+          <w:b/>
+          <w:bCs/>
+        </w:rPr>
+        <w:t xml:space="preserve">Contents</w:t>
+      </w:r>
+    </w:p>
+    <w:p>
+      <w:pPr>
+        <w:pStyle w:val="Compact"/>
+        <w:numPr>
+          <w:ilvl w:val="0"/>
+          <w:numId w:val="1001"/>
+        </w:numPr>
+      </w:pPr>
+      <w:r>
+        <w:t xml:space="preserve">Shared benchmark, labels, and methodology —</w:t>
+      </w:r>
+      <w:r>
+        <w:t xml:space="preserve"> </w:t>
+      </w:r>
+      <w:r>
+        <w:rPr>
+          <w:i/>
+          <w:iCs/>
+        </w:rPr>
+        <w:t xml:space="preserve">incl. 1.1 the two training/evaluation methods</w:t>
+      </w:r>
+    </w:p>
+    <w:p>
+      <w:pPr>
+        <w:pStyle w:val="Compact"/>
+        <w:numPr>
+          <w:ilvl w:val="0"/>
+          <w:numId w:val="1001"/>
+        </w:numPr>
+      </w:pPr>
+      <w:r>
+        <w:rPr>
+          <w:rStyle w:val="VerbatimChar"/>
+        </w:rPr>
+        <w:t xml:space="preserve">fold_change_prob</w:t>
+      </w:r>
+      <w:r>
+        <w:t xml:space="preserve"> </w:t>
+      </w:r>
+      <w:r>
+        <w:t xml:space="preserve">— structural axis</w:t>
+      </w:r>
+    </w:p>
+    <w:p>
+      <w:pPr>
+        <w:pStyle w:val="Compact"/>
+        <w:numPr>
+          <w:ilvl w:val="0"/>
+          <w:numId w:val="1001"/>
+        </w:numPr>
+      </w:pPr>
+      <w:r>
+        <w:rPr>
+          <w:rStyle w:val="VerbatimChar"/>
+        </w:rPr>
+        <w:t xml:space="preserve">impact_prob</w:t>
+      </w:r>
+      <w:r>
+        <w:t xml:space="preserve"> </w:t>
+      </w:r>
+      <w:r>
+        <w:t xml:space="preserve">— functional axis</w:t>
+      </w:r>
+    </w:p>
+    <w:p>
+      <w:pPr>
+        <w:pStyle w:val="Compact"/>
+        <w:numPr>
+          <w:ilvl w:val="0"/>
+          <w:numId w:val="1001"/>
+        </w:numPr>
+      </w:pPr>
+      <w:r>
+        <w:t xml:space="preserve">Why these features and not others (audit trail)</w:t>
+      </w:r>
+    </w:p>
+    <w:p>
+      <w:pPr>
+        <w:pStyle w:val="Compact"/>
+        <w:numPr>
+          <w:ilvl w:val="0"/>
+          <w:numId w:val="1001"/>
+        </w:numPr>
+      </w:pPr>
+      <w:r>
+        <w:t xml:space="preserve">Reproduction</w:t>
+      </w:r>
+    </w:p>
+    <w:p>
+      <w:pPr>
+        <w:pStyle w:val="Compact"/>
+        <w:numPr>
+          <w:ilvl w:val="0"/>
+          <w:numId w:val="1001"/>
+        </w:numPr>
+      </w:pPr>
+      <w:r>
+        <w:t xml:space="preserve">Review checklist / essentials</w:t>
+      </w:r>
+    </w:p>
+    <w:p>
+      <w:pPr>
+        <w:pStyle w:val="Compact"/>
+        <w:numPr>
+          <w:ilvl w:val="0"/>
+          <w:numId w:val="1002"/>
+        </w:numPr>
+      </w:pPr>
+      <w:r>
+        <w:t xml:space="preserve">Appendix A — Every feature evaluated, and where it comes from</w:t>
+      </w:r>
+    </w:p>
+    <w:p>
+      <w:pPr>
+        <w:pStyle w:val="Compact"/>
+        <w:numPr>
+          <w:ilvl w:val="0"/>
+          <w:numId w:val="1002"/>
+        </w:numPr>
+      </w:pPr>
+      <w:r>
+        <w:t xml:space="preserve">Appendix B — Comparable published methods</w:t>
+      </w:r>
+    </w:p>
+    <w:p>
       <w:r>
         <w:pict>
           <v:rect style="width:0;height:1.5pt" o:hralign="center" o:hrstd="t" o:hr="t"/>
@@ -802,7 +912,7 @@
         <w:pStyle w:val="Compact"/>
         <w:numPr>
           <w:ilvl w:val="0"/>
-          <w:numId w:val="1001"/>
+          <w:numId w:val="1003"/>
         </w:numPr>
       </w:pPr>
       <w:r>
@@ -824,7 +934,7 @@
         <w:pStyle w:val="Compact"/>
         <w:numPr>
           <w:ilvl w:val="0"/>
-          <w:numId w:val="1001"/>
+          <w:numId w:val="1003"/>
         </w:numPr>
       </w:pPr>
       <w:r>
@@ -846,7 +956,7 @@
         <w:pStyle w:val="Compact"/>
         <w:numPr>
           <w:ilvl w:val="0"/>
-          <w:numId w:val="1001"/>
+          <w:numId w:val="1003"/>
         </w:numPr>
       </w:pPr>
       <w:r>
@@ -1457,7 +1567,7 @@
         <w:pStyle w:val="Compact"/>
         <w:numPr>
           <w:ilvl w:val="0"/>
-          <w:numId w:val="1002"/>
+          <w:numId w:val="1004"/>
         </w:numPr>
       </w:pPr>
       <w:r>
@@ -1506,7 +1616,7 @@
         <w:pStyle w:val="Compact"/>
         <w:numPr>
           <w:ilvl w:val="0"/>
-          <w:numId w:val="1002"/>
+          <w:numId w:val="1004"/>
         </w:numPr>
       </w:pPr>
       <w:r>
@@ -3851,7 +3961,7 @@
         <w:pStyle w:val="Compact"/>
         <w:numPr>
           <w:ilvl w:val="0"/>
-          <w:numId w:val="1003"/>
+          <w:numId w:val="1005"/>
         </w:numPr>
       </w:pPr>
       <w:r>
@@ -3925,7 +4035,7 @@
         <w:pStyle w:val="Compact"/>
         <w:numPr>
           <w:ilvl w:val="0"/>
-          <w:numId w:val="1003"/>
+          <w:numId w:val="1005"/>
         </w:numPr>
       </w:pPr>
       <w:r>
@@ -4001,7 +4111,7 @@
         <w:pStyle w:val="Compact"/>
         <w:numPr>
           <w:ilvl w:val="0"/>
-          <w:numId w:val="1003"/>
+          <w:numId w:val="1005"/>
         </w:numPr>
       </w:pPr>
       <w:r>
@@ -4064,7 +4174,7 @@
         <w:pStyle w:val="Compact"/>
         <w:numPr>
           <w:ilvl w:val="0"/>
-          <w:numId w:val="1003"/>
+          <w:numId w:val="1005"/>
         </w:numPr>
       </w:pPr>
       <w:r>
@@ -5930,7 +6040,7 @@
         <w:pStyle w:val="Compact"/>
         <w:numPr>
           <w:ilvl w:val="0"/>
-          <w:numId w:val="1004"/>
+          <w:numId w:val="1006"/>
         </w:numPr>
       </w:pPr>
       <w:r>
@@ -6025,7 +6135,7 @@
         <w:pStyle w:val="Compact"/>
         <w:numPr>
           <w:ilvl w:val="0"/>
-          <w:numId w:val="1004"/>
+          <w:numId w:val="1006"/>
         </w:numPr>
       </w:pPr>
       <w:r>
@@ -6053,7 +6163,7 @@
         <w:pStyle w:val="Compact"/>
         <w:numPr>
           <w:ilvl w:val="0"/>
-          <w:numId w:val="1004"/>
+          <w:numId w:val="1006"/>
         </w:numPr>
       </w:pPr>
       <w:r>
@@ -6130,7 +6240,7 @@
         <w:pStyle w:val="Compact"/>
         <w:numPr>
           <w:ilvl w:val="0"/>
-          <w:numId w:val="1004"/>
+          <w:numId w:val="1006"/>
         </w:numPr>
       </w:pPr>
       <w:r>
@@ -6189,7 +6299,7 @@
         <w:pStyle w:val="Compact"/>
         <w:numPr>
           <w:ilvl w:val="0"/>
-          <w:numId w:val="1005"/>
+          <w:numId w:val="1007"/>
         </w:numPr>
       </w:pPr>
       <w:r>
@@ -6227,7 +6337,7 @@
         <w:pStyle w:val="Compact"/>
         <w:numPr>
           <w:ilvl w:val="0"/>
-          <w:numId w:val="1005"/>
+          <w:numId w:val="1007"/>
         </w:numPr>
       </w:pPr>
       <w:r>
@@ -6321,7 +6431,7 @@
         <w:pStyle w:val="Compact"/>
         <w:numPr>
           <w:ilvl w:val="0"/>
-          <w:numId w:val="1005"/>
+          <w:numId w:val="1007"/>
         </w:numPr>
       </w:pPr>
       <w:r>
@@ -6403,7 +6513,7 @@
         <w:pStyle w:val="Compact"/>
         <w:numPr>
           <w:ilvl w:val="0"/>
-          <w:numId w:val="1006"/>
+          <w:numId w:val="1008"/>
         </w:numPr>
       </w:pPr>
       <w:r>
@@ -6482,7 +6592,7 @@
         <w:pStyle w:val="Compact"/>
         <w:numPr>
           <w:ilvl w:val="0"/>
-          <w:numId w:val="1006"/>
+          <w:numId w:val="1008"/>
         </w:numPr>
       </w:pPr>
       <w:r>
@@ -6621,7 +6731,7 @@
         <w:pStyle w:val="Compact"/>
         <w:numPr>
           <w:ilvl w:val="0"/>
-          <w:numId w:val="1006"/>
+          <w:numId w:val="1008"/>
         </w:numPr>
       </w:pPr>
       <w:r>
@@ -6832,7 +6942,7 @@
         <w:pStyle w:val="Compact"/>
         <w:numPr>
           <w:ilvl w:val="0"/>
-          <w:numId w:val="1007"/>
+          <w:numId w:val="1009"/>
         </w:numPr>
       </w:pPr>
       <w:r>
@@ -6890,7 +7000,7 @@
         <w:pStyle w:val="Compact"/>
         <w:numPr>
           <w:ilvl w:val="0"/>
-          <w:numId w:val="1007"/>
+          <w:numId w:val="1009"/>
         </w:numPr>
       </w:pPr>
       <w:r>
@@ -6924,7 +7034,7 @@
         <w:pStyle w:val="Compact"/>
         <w:numPr>
           <w:ilvl w:val="0"/>
-          <w:numId w:val="1007"/>
+          <w:numId w:val="1009"/>
         </w:numPr>
       </w:pPr>
       <w:r>
@@ -6967,7 +7077,7 @@
         <w:pStyle w:val="Compact"/>
         <w:numPr>
           <w:ilvl w:val="0"/>
-          <w:numId w:val="1007"/>
+          <w:numId w:val="1009"/>
         </w:numPr>
       </w:pPr>
       <w:r>
@@ -7001,7 +7111,7 @@
         <w:pStyle w:val="Compact"/>
         <w:numPr>
           <w:ilvl w:val="0"/>
-          <w:numId w:val="1007"/>
+          <w:numId w:val="1009"/>
         </w:numPr>
       </w:pPr>
       <w:r>
@@ -7029,7 +7139,7 @@
         <w:pStyle w:val="Compact"/>
         <w:numPr>
           <w:ilvl w:val="0"/>
-          <w:numId w:val="1007"/>
+          <w:numId w:val="1009"/>
         </w:numPr>
       </w:pPr>
       <w:r>
@@ -7063,7 +7173,7 @@
         <w:pStyle w:val="Compact"/>
         <w:numPr>
           <w:ilvl w:val="0"/>
-          <w:numId w:val="1007"/>
+          <w:numId w:val="1009"/>
         </w:numPr>
       </w:pPr>
       <w:r>
@@ -7151,7 +7261,7 @@
         <w:pStyle w:val="Compact"/>
         <w:numPr>
           <w:ilvl w:val="0"/>
-          <w:numId w:val="1007"/>
+          <w:numId w:val="1009"/>
         </w:numPr>
       </w:pPr>
       <w:r>
@@ -10921,6 +11031,91 @@
     <w:lvl w:ilvl="8">
       <w:numFmt w:val="bullet"/>
       <w:lvlText w:val=" "/>
+      <w:lvlJc w:val="left"/>
+      <w:pPr>
+        <w:ind w:left="6480" w:hanging="360"/>
+      </w:pPr>
+    </w:lvl>
+  </w:abstractNum>
+  <w:abstractNum w:abstractNumId="99411">
+    <w:nsid w:val="00A99411"/>
+    <w:multiLevelType w:val="multilevel"/>
+    <w:lvl w:ilvl="0">
+      <w:start w:val="1"/>
+      <w:numFmt w:val="decimal"/>
+      <w:lvlText w:val="%1."/>
+      <w:lvlJc w:val="left"/>
+      <w:pPr>
+        <w:ind w:left="720" w:hanging="360"/>
+      </w:pPr>
+    </w:lvl>
+    <w:lvl w:ilvl="1">
+      <w:start w:val="1"/>
+      <w:numFmt w:val="decimal"/>
+      <w:lvlText w:val="%2."/>
+      <w:lvlJc w:val="left"/>
+      <w:pPr>
+        <w:ind w:left="1440" w:hanging="360"/>
+      </w:pPr>
+    </w:lvl>
+    <w:lvl w:ilvl="2">
+      <w:start w:val="1"/>
+      <w:numFmt w:val="decimal"/>
+      <w:lvlText w:val="%3."/>
+      <w:lvlJc w:val="left"/>
+      <w:pPr>
+        <w:ind w:left="2160" w:hanging="360"/>
+      </w:pPr>
+    </w:lvl>
+    <w:lvl w:ilvl="3">
+      <w:start w:val="1"/>
+      <w:numFmt w:val="decimal"/>
+      <w:lvlText w:val="%4."/>
+      <w:lvlJc w:val="left"/>
+      <w:pPr>
+        <w:ind w:left="2880" w:hanging="360"/>
+      </w:pPr>
+    </w:lvl>
+    <w:lvl w:ilvl="4">
+      <w:start w:val="1"/>
+      <w:numFmt w:val="decimal"/>
+      <w:lvlText w:val="%5."/>
+      <w:lvlJc w:val="left"/>
+      <w:pPr>
+        <w:ind w:left="3600" w:hanging="360"/>
+      </w:pPr>
+    </w:lvl>
+    <w:lvl w:ilvl="5">
+      <w:start w:val="1"/>
+      <w:numFmt w:val="decimal"/>
+      <w:lvlText w:val="%6."/>
+      <w:lvlJc w:val="left"/>
+      <w:pPr>
+        <w:ind w:left="4320" w:hanging="360"/>
+      </w:pPr>
+    </w:lvl>
+    <w:lvl w:ilvl="6">
+      <w:start w:val="1"/>
+      <w:numFmt w:val="decimal"/>
+      <w:lvlText w:val="%7."/>
+      <w:lvlJc w:val="left"/>
+      <w:pPr>
+        <w:ind w:left="5040" w:hanging="360"/>
+      </w:pPr>
+    </w:lvl>
+    <w:lvl w:ilvl="7">
+      <w:start w:val="1"/>
+      <w:numFmt w:val="decimal"/>
+      <w:lvlText w:val="%8."/>
+      <w:lvlJc w:val="left"/>
+      <w:pPr>
+        <w:ind w:left="5760" w:hanging="360"/>
+      </w:pPr>
+    </w:lvl>
+    <w:lvl w:ilvl="8">
+      <w:start w:val="1"/>
+      <w:numFmt w:val="decimal"/>
+      <w:lvlText w:val="%9."/>
       <w:lvlJc w:val="left"/>
       <w:pPr>
         <w:ind w:left="6480" w:hanging="360"/>
@@ -11030,110 +11225,10 @@
       </w:rPr>
     </w:lvl>
   </w:abstractNum>
-  <w:abstractNum w:abstractNumId="99411">
-    <w:nsid w:val="00A99411"/>
-    <w:multiLevelType w:val="multilevel"/>
-    <w:lvl w:ilvl="0">
-      <w:start w:val="1"/>
-      <w:numFmt w:val="decimal"/>
-      <w:lvlText w:val="%1."/>
-      <w:lvlJc w:val="left"/>
-      <w:pPr>
-        <w:ind w:left="720" w:hanging="360"/>
-      </w:pPr>
-    </w:lvl>
-    <w:lvl w:ilvl="1">
-      <w:start w:val="1"/>
-      <w:numFmt w:val="decimal"/>
-      <w:lvlText w:val="%2."/>
-      <w:lvlJc w:val="left"/>
-      <w:pPr>
-        <w:ind w:left="1440" w:hanging="360"/>
-      </w:pPr>
-    </w:lvl>
-    <w:lvl w:ilvl="2">
-      <w:start w:val="1"/>
-      <w:numFmt w:val="decimal"/>
-      <w:lvlText w:val="%3."/>
-      <w:lvlJc w:val="left"/>
-      <w:pPr>
-        <w:ind w:left="2160" w:hanging="360"/>
-      </w:pPr>
-    </w:lvl>
-    <w:lvl w:ilvl="3">
-      <w:start w:val="1"/>
-      <w:numFmt w:val="decimal"/>
-      <w:lvlText w:val="%4."/>
-      <w:lvlJc w:val="left"/>
-      <w:pPr>
-        <w:ind w:left="2880" w:hanging="360"/>
-      </w:pPr>
-    </w:lvl>
-    <w:lvl w:ilvl="4">
-      <w:start w:val="1"/>
-      <w:numFmt w:val="decimal"/>
-      <w:lvlText w:val="%5."/>
-      <w:lvlJc w:val="left"/>
-      <w:pPr>
-        <w:ind w:left="3600" w:hanging="360"/>
-      </w:pPr>
-    </w:lvl>
-    <w:lvl w:ilvl="5">
-      <w:start w:val="1"/>
-      <w:numFmt w:val="decimal"/>
-      <w:lvlText w:val="%6."/>
-      <w:lvlJc w:val="left"/>
-      <w:pPr>
-        <w:ind w:left="4320" w:hanging="360"/>
-      </w:pPr>
-    </w:lvl>
-    <w:lvl w:ilvl="6">
-      <w:start w:val="1"/>
-      <w:numFmt w:val="decimal"/>
-      <w:lvlText w:val="%7."/>
-      <w:lvlJc w:val="left"/>
-      <w:pPr>
-        <w:ind w:left="5040" w:hanging="360"/>
-      </w:pPr>
-    </w:lvl>
-    <w:lvl w:ilvl="7">
-      <w:start w:val="1"/>
-      <w:numFmt w:val="decimal"/>
-      <w:lvlText w:val="%8."/>
-      <w:lvlJc w:val="left"/>
-      <w:pPr>
-        <w:ind w:left="5760" w:hanging="360"/>
-      </w:pPr>
-    </w:lvl>
-    <w:lvl w:ilvl="8">
-      <w:start w:val="1"/>
-      <w:numFmt w:val="decimal"/>
-      <w:lvlText w:val="%9."/>
-      <w:lvlJc w:val="left"/>
-      <w:pPr>
-        <w:ind w:left="6480" w:hanging="360"/>
-      </w:pPr>
-    </w:lvl>
-  </w:abstractNum>
   <w:num w:numId="1000">
     <w:abstractNumId w:val="990"/>
   </w:num>
   <w:num w:numId="1001">
-    <w:abstractNumId w:val="991"/>
-  </w:num>
-  <w:num w:numId="1002">
-    <w:abstractNumId w:val="991"/>
-  </w:num>
-  <w:num w:numId="1003">
-    <w:abstractNumId w:val="991"/>
-  </w:num>
-  <w:num w:numId="1004">
-    <w:abstractNumId w:val="991"/>
-  </w:num>
-  <w:num w:numId="1005">
-    <w:abstractNumId w:val="991"/>
-  </w:num>
-  <w:num w:numId="1006">
     <w:abstractNumId w:val="99411"/>
     <w:lvlOverride w:ilvl="0">
       <w:startOverride w:val="1"/>
@@ -11163,7 +11258,55 @@
       <w:startOverride w:val="1"/>
     </w:lvlOverride>
   </w:num>
+  <w:num w:numId="1002">
+    <w:abstractNumId w:val="991"/>
+  </w:num>
+  <w:num w:numId="1003">
+    <w:abstractNumId w:val="991"/>
+  </w:num>
+  <w:num w:numId="1004">
+    <w:abstractNumId w:val="991"/>
+  </w:num>
+  <w:num w:numId="1005">
+    <w:abstractNumId w:val="991"/>
+  </w:num>
+  <w:num w:numId="1006">
+    <w:abstractNumId w:val="991"/>
+  </w:num>
   <w:num w:numId="1007">
+    <w:abstractNumId w:val="991"/>
+  </w:num>
+  <w:num w:numId="1008">
+    <w:abstractNumId w:val="99411"/>
+    <w:lvlOverride w:ilvl="0">
+      <w:startOverride w:val="1"/>
+    </w:lvlOverride>
+    <w:lvlOverride w:ilvl="1">
+      <w:startOverride w:val="1"/>
+    </w:lvlOverride>
+    <w:lvlOverride w:ilvl="2">
+      <w:startOverride w:val="1"/>
+    </w:lvlOverride>
+    <w:lvlOverride w:ilvl="3">
+      <w:startOverride w:val="1"/>
+    </w:lvlOverride>
+    <w:lvlOverride w:ilvl="4">
+      <w:startOverride w:val="1"/>
+    </w:lvlOverride>
+    <w:lvlOverride w:ilvl="5">
+      <w:startOverride w:val="1"/>
+    </w:lvlOverride>
+    <w:lvlOverride w:ilvl="6">
+      <w:startOverride w:val="1"/>
+    </w:lvlOverride>
+    <w:lvlOverride w:ilvl="7">
+      <w:startOverride w:val="1"/>
+    </w:lvlOverride>
+    <w:lvlOverride w:ilvl="8">
+      <w:startOverride w:val="1"/>
+    </w:lvlOverride>
+  </w:num>
+  <w:num w:numId="1009">
     <w:abstractNumId w:val="991"/>
   </w:num>
 </w:numbering>

</xml_diff>